<commit_message>
Doku: eigene Verdrahtungs-Word-Doku v1 + Querverweise
- Hoftor_Verdrahtung_v1.docx (+ .md-Quelle): Hardware/Belegungsplan aus §6a,
  formal + druckbar (Nummerierung, Relais, Aderfarben, Bruecken, Checkliste,
  Designprinzipien). Erzeugt mit Pandoc, echte Ueberschriften + TOC.
- Querverweis Verdrahtungs-Doku -> Firmware-Doku + CLAUDE.md
- Rueckverweis in Hoftor_Dokumentation_v0.35.docx (chirurgischer XML-Insert,
  Formatierung erhalten) -> Verdrahtungs-Doku
- CLAUDE.md §10: beide Word-Docs gelistet (Firmware vs Hardware)

Co-Authored-By: Claude Opus 4.8 <noreply@anthropic.com>
</commit_message>
<xml_diff>
--- a/Hoftor_Dokumentation_v0.35.docx
+++ b/Hoftor_Dokumentation_v0.35.docx
@@ -19547,6 +19547,23 @@
           <w:szCs w:val="18"/>
         </w:rPr>
         <w:t xml:space="preserve"/>
+      </w:r>
+    </w:p>
+    <w:p>
+      <w:pPr>
+        <w:pBdr>
+          <w:top w:val="single" w:color="1F4E79" w:sz="6" w:space="6"/>
+        </w:pBdr>
+        <w:spacing w:before="240" w:after="0"/>
+      </w:pPr>
+      <w:r>
+        <w:rPr>
+          <w:rFonts w:ascii="Arial" w:cs="Arial" w:eastAsia="Arial" w:hAnsi="Arial"/>
+          <w:i/>
+          <w:iCs/>
+          <w:sz w:val="20"/>
+        </w:rPr>
+        <w:t xml:space="preserve">Querverweis: Hardware-Aufbau, Verdrahtung und Belegungsplan siehe Hoftor_Verdrahtung_v1.docx (sowie CLAUDE.md, Abschnitt 6a).</w:t>
       </w:r>
     </w:p>
     <w:sectPr>

</xml_diff>

<commit_message>
Hoftor-Doku-Update + Schaltplaene v1/v2 - offene Arbeit beim NAS-Umzug abgeschlossen
</commit_message>
<xml_diff>
--- a/Hoftor_Dokumentation_v0.35.docx
+++ b/Hoftor_Dokumentation_v0.35.docx
@@ -19547,23 +19547,6 @@
           <w:szCs w:val="18"/>
         </w:rPr>
         <w:t xml:space="preserve"/>
-      </w:r>
-    </w:p>
-    <w:p>
-      <w:pPr>
-        <w:pBdr>
-          <w:top w:val="single" w:color="1F4E79" w:sz="6" w:space="6"/>
-        </w:pBdr>
-        <w:spacing w:before="240" w:after="0"/>
-      </w:pPr>
-      <w:r>
-        <w:rPr>
-          <w:rFonts w:ascii="Arial" w:cs="Arial" w:eastAsia="Arial" w:hAnsi="Arial"/>
-          <w:i/>
-          <w:iCs/>
-          <w:sz w:val="20"/>
-        </w:rPr>
-        <w:t xml:space="preserve">Querverweis: Hardware-Aufbau, Verdrahtung und Belegungsplan siehe Hoftor_Verdrahtung_v1.docx (sowie CLAUDE.md, Abschnitt 6a).</w:t>
       </w:r>
     </w:p>
     <w:sectPr>

</xml_diff>